<commit_message>
Version of the presentation
</commit_message>
<xml_diff>
--- a/notes/main_methodology.docx
+++ b/notes/main_methodology.docx
@@ -1147,70 +1147,6 @@
     <w:p>
       <w:pPr>
         <w:pStyle w:val="NoSpacing"/>
-        <w:rPr>
-          <w:rFonts w:ascii="Arial" w:hAnsi="Arial" w:cs="Arial"/>
-          <w:b/>
-          <w:bCs/>
-          <w:lang w:val="es-PE"/>
-        </w:rPr>
-      </w:pPr>
-    </w:p>
-    <w:p>
-      <w:pPr>
-        <w:pStyle w:val="NoSpacing"/>
-        <w:rPr>
-          <w:rFonts w:ascii="Arial" w:hAnsi="Arial" w:cs="Arial"/>
-          <w:b/>
-          <w:bCs/>
-          <w:lang w:val="es-PE"/>
-        </w:rPr>
-      </w:pPr>
-    </w:p>
-    <w:p>
-      <w:pPr>
-        <w:pStyle w:val="NoSpacing"/>
-        <w:rPr>
-          <w:rFonts w:ascii="Arial" w:hAnsi="Arial" w:cs="Arial"/>
-          <w:b/>
-          <w:bCs/>
-          <w:lang w:val="es-PE"/>
-        </w:rPr>
-      </w:pPr>
-    </w:p>
-    <w:p>
-      <w:pPr>
-        <w:pStyle w:val="NoSpacing"/>
-        <w:ind w:left="720"/>
-        <w:rPr>
-          <w:rFonts w:ascii="Arial" w:hAnsi="Arial" w:cs="Arial"/>
-          <w:lang w:val="es-PE"/>
-        </w:rPr>
-      </w:pPr>
-    </w:p>
-    <w:p>
-      <w:pPr>
-        <w:pStyle w:val="NoSpacing"/>
-        <w:ind w:left="720"/>
-        <w:rPr>
-          <w:rFonts w:ascii="Arial" w:hAnsi="Arial" w:cs="Arial"/>
-          <w:lang w:val="es-PE"/>
-        </w:rPr>
-      </w:pPr>
-    </w:p>
-    <w:p>
-      <w:pPr>
-        <w:pStyle w:val="NoSpacing"/>
-        <w:ind w:left="720"/>
-        <w:rPr>
-          <w:rFonts w:ascii="Arial" w:hAnsi="Arial" w:cs="Arial"/>
-          <w:lang w:val="es-PE"/>
-        </w:rPr>
-      </w:pPr>
-    </w:p>
-    <w:p>
-      <w:pPr>
-        <w:pStyle w:val="NoSpacing"/>
-        <w:ind w:left="720"/>
         <w:rPr>
           <w:rFonts w:ascii="Arial" w:hAnsi="Arial" w:cs="Arial"/>
           <w:lang w:val="es-PE"/>
@@ -2279,6 +2215,7 @@
   <w:style w:type="character" w:default="1" w:styleId="DefaultParagraphFont">
     <w:name w:val="Default Paragraph Font"/>
     <w:uiPriority w:val="1"/>
+    <w:semiHidden/>
     <w:unhideWhenUsed/>
   </w:style>
   <w:style w:type="table" w:default="1" w:styleId="TableNormal">

</xml_diff>